<commit_message>
Restore migration fidelity for six GPT plugins
</commit_message>
<xml_diff>
--- a/plugins/approval-excel/skills/instructions/references/기본 안내 메시지 및 품의 유형별 템플릿.docx
+++ b/plugins/approval-excel/skills/instructions/references/기본 안내 메시지 및 품의 유형별 템플릿.docx
@@ -693,7 +693,7 @@
           <w:sz w:val="24"/>
           <w:szCs w:val="24"/>
         </w:rPr>
-        <w:t xml:space="preserve">  나. 공급업체: 가상업체</w:t>
+        <w:t xml:space="preserve">  나. 공급업체: [견적서에서 추출된 업체명] (반드시 견적서 업로드 시에만 추가)</w:t>
       </w:r>
       <w:r>
         <w:rPr>
@@ -1171,7 +1171,7 @@
           <w:sz w:val="24"/>
           <w:szCs w:val="24"/>
         </w:rPr>
-        <w:t>]을 아래와 같이 운영에 따른 강사 [가상 인물 A] 및 참교통을 다음과 같이 지급하고자 합니다.</w:t>
+        <w:t>]을 아래와 같이 운영에 따른 강사 수당 및 참교통을 다음과 같이 지급하고자 합니다.</w:t>
       </w:r>
     </w:p>
     <w:p>
@@ -1715,7 +1715,7 @@
           <w:sz w:val="24"/>
           <w:szCs w:val="24"/>
         </w:rPr>
-        <w:t>] 강사 [가상 인물 A] 지급 내역 각 1부.  끝.</w:t>
+        <w:t>] 강사 수당 지급 내역 각 1부.  끝.</w:t>
       </w:r>
     </w:p>
     <w:p>
@@ -2143,7 +2143,7 @@
           <w:sz w:val="24"/>
           <w:szCs w:val="24"/>
         </w:rPr>
-        <w:t xml:space="preserve">  마. 공급업체: 가상업체</w:t>
+        <w:t xml:space="preserve">  마. 공급업체: [견적서에서 추출된 업체명] (견적서 업로드 시 추가)</w:t>
       </w:r>
     </w:p>
     <w:p>

</xml_diff>